<commit_message>
docs: reorder the plan to mirror how the backend/mobile app were built
Supersedes the "Real Estate first" build order: the admin panel now
follows the exact phase sequence bizops360-api and the Flutter apps were
already built in (per the newly-added BizOps360_Specification.docx) —
Organization, HR, Operations, CRM, Finance as full tenant-facing modules
first (phases 1-5, grounded against each module's actual live routes),
then one industry module (Real Estate, phase 6), then the platform-
operator-only screens (phase 7, which needs two new backend endpoints),
then production hardening. Updates README to match.

Co-Authored-By: Claude Sonnet 5 <noreply@anthropic.com>
</commit_message>
<xml_diff>
--- a/BizOps360_Admin_Panel_Plan.docx
+++ b/BizOps360_Admin_Panel_Plan.docx
@@ -19,7 +19,7 @@
           <w:i/>
           <w:iCs/>
         </w:rPr>
-        <w:t xml:space="preserve">Platform-operator console for BizOps 360 — built as one real, working vertical slice first, then generalized. Planning only — no application code has been written; the build itself happens separately (Mac/Docker).</w:t>
+        <w:t xml:space="preserve">A web front end for bizops360-api, built in the same phase order the backend and Flutter app were already built in (per BizOps360_Specification.docx): the core tenant-facing platform first, one industry module next, platform-operator concerns after. Planning only — no application code has been written; the build itself happens separately (Mac/Docker).</w:t>
       </w:r>
     </w:p>
     <w:p>
@@ -43,7 +43,15 @@
         <w:spacing w:after="160"/>
       </w:pPr>
       <w:r>
-        <w:t xml:space="preserve">The BizOps 360 platform-operator console — the tool the BizOps 360 team (not tenant staff) uses to run the SaaS business: manage tenants, subscriptions/billing, industry-module verification queues, platform analytics, and audit oversight. It talks to bizops360-api (Laravel) over the same versioned REST API (/api/v1) the Flutter mobile apps use — never touching PostgreSQL directly. A platform-admin user authenticates the same way mobile does (POST /api/v1/auth/login → Sanctum token → GET /api/v1/auth/me for is_platform_admin + permissions); the backend stays the sole authorization authority.</w:t>
+        <w:t xml:space="preserve">A Next.js web application that gives every bizops360-api module a real interface — something no module has today (Filament was the spec's original plan for this but was never built; the Flutter app only covers a mobile, field-operations slice). It serves both tenant staff (Organization/HR/Operations/CRM/Finance — a desktop counterpart to the Flutter app, for the screens that work better on a bigger screen: bulk employee management, financial reports, CRM pipelines) and, once Phase 7 lands, the BizOps 360 team running the platform itself (tenants, billing, cross-vertical verification, audit). One app, one login, adapting by role and permission — never forked — the same principle the spec and the mobile apps already establish.</w:t>
+      </w:r>
+    </w:p>
+    <w:p>
+      <w:pPr>
+        <w:spacing w:after="160"/>
+      </w:pPr>
+      <w:r>
+        <w:t xml:space="preserve">It talks to bizops360-api over the same versioned REST API (/api/v1) the Flutter apps use — never touching Postgres directly. A user authenticates the same way mobile does (POST /api/v1/auth/login → Sanctum token → GET /api/v1/auth/me for roles/permissions/tenant/is_platform_admin); the backend stays the sole authorization authority.</w:t>
       </w:r>
     </w:p>
     <w:p>
@@ -129,7 +137,7 @@
                 <w:b w:val="false"/>
                 <w:bCs w:val="false"/>
               </w:rPr>
-              <w:t xml:space="preserve">Next.js 16 (App Router) + TypeScript. Server components for data-heavy list/detail screens, client components only where interaction requires it — keeps the platform-admin console fast without a heavy client bundle.</w:t>
+              <w:t xml:space="preserve">Next.js (App Router) + TypeScript. Server components for the data-heavy list/detail screens every module phase needs (employees, tasks, leads, invoices...), client components only where interaction requires it.</w:t>
             </w:r>
           </w:p>
         </w:tc>
@@ -159,7 +167,7 @@
                 <w:b w:val="false"/>
                 <w:bCs w:val="false"/>
               </w:rPr>
-              <w:t xml:space="preserve">shadcn/ui + Radix primitives + Tailwind CSS. Source-owned components (not a black-box library) scale better than a PHP-rendered admin framework once the screen count grows past a few dozen, which an operator console covering every industry module eventually will.</w:t>
+              <w:t xml:space="preserve">shadcn/ui + Radix primitives + Tailwind CSS. Source-owned components scale better than a black-box admin framework once the screen count spans six business modules plus an industry vertical.</w:t>
             </w:r>
           </w:p>
         </w:tc>
@@ -189,7 +197,7 @@
                 <w:b w:val="false"/>
                 <w:bCs w:val="false"/>
               </w:rPr>
-              <w:t xml:space="preserve">React Hook Form + Zod — the verification queue's document-checklist review and reject-with-reason flows are form-heavy and need real client-side validation before hitting the API.</w:t>
+              <w:t xml:space="preserve">React Hook Form + Zod — every module phase is form-heavy (employee onboarding, leave requests, invoices, leads, the Real Estate verification checklist) and needs real client-side validation before hitting the API.</w:t>
             </w:r>
           </w:p>
         </w:tc>
@@ -249,7 +257,7 @@
                 <w:b w:val="false"/>
                 <w:bCs w:val="false"/>
               </w:rPr>
-              <w:t xml:space="preserve">TanStack Table — tenant lists, verification queues and future audit logs all need sortable/filterable tables with pagination matching the API's own paginate() envelope.</w:t>
+              <w:t xml:space="preserve">TanStack Table — every module phase centers on sortable/filterable/paginated tables matching the API's own paginate() envelope (employees, tasks, leads, invoices, and later the Real Estate project/pipeline lists).</w:t>
             </w:r>
           </w:p>
         </w:tc>
@@ -279,7 +287,7 @@
                 <w:b w:val="false"/>
                 <w:bCs w:val="false"/>
               </w:rPr>
-              <w:t xml:space="preserve">Recharts, for the billing/analytics overview (GET /api/v1/platform/analytics).</w:t>
+              <w:t xml:space="preserve">Recharts, for Operations/CRM/Finance reports and the later platform analytics view.</w:t>
             </w:r>
           </w:p>
         </w:tc>
@@ -309,7 +317,7 @@
                 <w:b w:val="false"/>
                 <w:bCs w:val="false"/>
               </w:rPr>
-              <w:t xml:space="preserve">Backend-issued Sanctum token, stored httpOnly; every request carries it to bizops360-api. No parallel auth system — the backend remains the sole authorization authority, matching the Flutter apps' own auth model.</w:t>
+              <w:t xml:space="preserve">Backend-issued Sanctum token, stored httpOnly; every request carries it to bizops360-api. No parallel auth system — the backend remains the sole authorization authority, matching the Flutter app's own model. The same login screen serves tenant staff and platform admins; the UI adapts by role/permission exactly like the mobile app does.</w:t>
             </w:r>
           </w:p>
         </w:tc>
@@ -339,7 +347,7 @@
                 <w:b w:val="false"/>
                 <w:bCs w:val="false"/>
               </w:rPr>
-              <w:t xml:space="preserve">Vercel (or the same Render account already hosting bizops360-api, for one bill) + GitHub Actions (lint, typecheck, build) on every push, mirroring the mobile repos' CI pattern.</w:t>
+              <w:t xml:space="preserve">Vercel (or the same Render account already hosting bizops360-api) + GitHub Actions (lint, typecheck, build) on every push, mirroring the mobile repos' CI pattern.</w:t>
             </w:r>
           </w:p>
         </w:tc>
@@ -355,7 +363,7 @@
         <w:pStyle w:val="Heading1"/>
       </w:pPr>
       <w:r>
-        <w:t xml:space="preserve">3. The build order — one real module first</w:t>
+        <w:t xml:space="preserve">3. Build order: mirror how the backend itself was built</w:t>
       </w:r>
     </w:p>
     <w:p>
@@ -363,7 +371,7 @@
         <w:spacing w:after="160"/>
       </w:pPr>
       <w:r>
-        <w:t xml:space="preserve">A generic admin shell built against imagined requirements tends to guess wrong. Instead:</w:t>
+        <w:t xml:space="preserve">The backend (bizops360-api) and the Flutter mobile app were both built phase by phase from BizOps360_Specification.docx — Organization, then HR, then Operations, then CRM, then Finance, then one industry module. The admin panel follows that exact order, module by module, so each phase targets an API surface that already exists and is already proven (the mobile app is already consuming it in production use). No phase starts against a backend that isn't ready.</w:t>
       </w:r>
     </w:p>
     <w:p>
@@ -376,7 +384,7 @@
         <w:spacing w:after="80"/>
       </w:pPr>
       <w:r>
-        <w:t xml:space="preserve">Phase 0 builds the panel AND wires it to one real, already-working industry module end-to-end — no placeholder screens, no mock data. Real Estate is the choice: its verification-queue API already exists server-side (app/Modules/Industry/RealEstate in bizops360-api) with no UI anywhere yet, so it is the highest-leverage, lowest-risk first slice.</w:t>
+        <w:t xml:space="preserve">Phases 1–5 give the panel full coverage of the shared business platform — the same modules every tenant uses regardless of industry.</w:t>
       </w:r>
     </w:p>
     <w:p>
@@ -389,7 +397,7 @@
         <w:spacing w:after="80"/>
       </w:pPr>
       <w:r>
-        <w:t xml:space="preserve">Only once that one module works completely — auth, layout, data fetching, permission gating, the actual verification workflow a human would use — does the plan generalize the pattern and add a second module (Travel).</w:t>
+        <w:t xml:space="preserve">Phase 6 adds one industry module (Real Estate) end-to-end, proving the pattern for vertical-specific screens before a second vertical (Travel) is attempted.</w:t>
       </w:r>
     </w:p>
     <w:p>
@@ -402,7 +410,7 @@
         <w:spacing w:after="80"/>
       </w:pPr>
       <w:r>
-        <w:t xml:space="preserve">This avoids over-abstracting a “generic industry module” concept before a single real example exists to abstract from.</w:t>
+        <w:t xml:space="preserve">Phase 7 adds the cross-tenant, platform-operator-only screens (tenant management, billing, audit) — deliberately after the tenant-facing modules exist, since a platform admin's job is largely looking into a tenant's own Organization/CRM/Finance data, which needs to already be visible by then.</w:t>
       </w:r>
     </w:p>
     <w:p>
@@ -410,23 +418,7 @@
         <w:pStyle w:val="Heading1"/>
       </w:pPr>
       <w:r>
-        <w:t xml:space="preserve">4. Scope decision: platform-operator console, not a tenant back-office</w:t>
-      </w:r>
-    </w:p>
-    <w:p>
-      <w:pPr>
-        <w:spacing w:after="160"/>
-      </w:pPr>
-      <w:r>
-        <w:t xml:space="preserve">An earlier draft's proposed sitemap (Organizations/Employees/CRM/Finance/HR/Travel/RealEstate) describes a broader tenant-facing back-office web app — a desktop counterpart to the Flutter mobile apps. That is a separate, not-yet-made product decision. This plan's phases are scoped to the platform-operator console only. A tenant-facing area may be added later as an explicit route group alongside the platform one, never by default.</w:t>
-      </w:r>
-    </w:p>
-    <w:p>
-      <w:pPr>
-        <w:pStyle w:val="Heading1"/>
-      </w:pPr>
-      <w:r>
-        <w:t xml:space="preserve">5. Phased plan</w:t>
+        <w:t xml:space="preserve">4. Phased plan</w:t>
       </w:r>
     </w:p>
     <w:tbl>
@@ -442,13 +434,13 @@
         </w:tblBorders>
       </w:tblPr>
       <w:tblGrid>
-        <w:gridCol w:w="1400"/>
-        <w:gridCol w:w="8100"/>
+        <w:gridCol w:w="1300"/>
+        <w:gridCol w:w="8200"/>
       </w:tblGrid>
       <w:tr>
         <w:tc>
           <w:tcPr>
-            <w:tcW w:type="dxa" w:w="1400"/>
+            <w:tcW w:type="dxa" w:w="1300"/>
             <w:shd w:fill="1C6B54" w:val="clear"/>
           </w:tcPr>
           <w:p>
@@ -464,7 +456,7 @@
         </w:tc>
         <w:tc>
           <w:tcPr>
-            <w:tcW w:type="dxa" w:w="8100"/>
+            <w:tcW w:type="dxa" w:w="8200"/>
             <w:shd w:fill="1C6B54" w:val="clear"/>
           </w:tcPr>
           <w:p>
@@ -482,149 +474,269 @@
       <w:tr>
         <w:tc>
           <w:tcPr>
-            <w:tcW w:type="dxa" w:w="1400"/>
-          </w:tcPr>
-          <w:p>
-            <w:r>
-              <w:rPr>
-                <w:b w:val="false"/>
-                <w:bCs w:val="false"/>
-              </w:rPr>
-              <w:t xml:space="preserve">0 — Vertical-slice foundation</w:t>
-            </w:r>
-          </w:p>
-        </w:tc>
-        <w:tc>
-          <w:tcPr>
-            <w:tcW w:type="dxa" w:w="8100"/>
-          </w:tcPr>
-          <w:p>
-            <w:r>
-              <w:rPr>
-                <w:b w:val="false"/>
-                <w:bCs w:val="false"/>
-              </w:rPr>
-              <w:t xml:space="preserve">Next.js scaffold, platform-admin auth (Sanctum token + /auth/me + is_platform_admin guard), API client + data-fetching wiring, CI. Build exactly ONE working feature end-to-end against ONE real industry module — Real Estate, since its verification-queue API (POST /api/v1/projects/{id}/verify and /reject) already exists server-side with zero UI today. Backend prerequisite: add a platform-admin tenant list/detail endpoint (GET /api/v1/platform/tenants[/{id}]) — it doesn't exist yet.</w:t>
-            </w:r>
-          </w:p>
-        </w:tc>
-      </w:tr>
-      <w:tr>
-        <w:tc>
-          <w:tcPr>
-            <w:tcW w:type="dxa" w:w="1400"/>
-          </w:tcPr>
-          <w:p>
-            <w:r>
-              <w:rPr>
-                <w:b w:val="false"/>
-                <w:bCs w:val="false"/>
-              </w:rPr>
-              <w:t xml:space="preserve">1 — Real Estate module, complete</w:t>
-            </w:r>
-          </w:p>
-        </w:tc>
-        <w:tc>
-          <w:tcPr>
-            <w:tcW w:type="dxa" w:w="8100"/>
-          </w:tcPr>
-          <w:p>
-            <w:r>
-              <w:rPr>
-                <w:b w:val="false"/>
-                <w:bCs w:val="false"/>
-              </w:rPr>
-              <w:t xml:space="preserve">Finish out the Real Estate vertical inside the panel: project list/detail, the verification queue (Pending/Verified/Rejected, document checklist review, verify/reject actions), and a tenant/billing overview. This phase proves the panel's module-integration pattern (nav entry, list/detail routes, a typed API client module, permission gating) with a real, complete vertical — not a stub.</w:t>
-            </w:r>
-          </w:p>
-        </w:tc>
-      </w:tr>
-      <w:tr>
-        <w:tc>
-          <w:tcPr>
-            <w:tcW w:type="dxa" w:w="1400"/>
-          </w:tcPr>
-          <w:p>
-            <w:r>
-              <w:rPr>
-                <w:b w:val="false"/>
-                <w:bCs w:val="false"/>
-              </w:rPr>
-              <w:t xml:space="preserve">2 — Generalize the pattern, add Travel</w:t>
-            </w:r>
-          </w:p>
-        </w:tc>
-        <w:tc>
-          <w:tcPr>
-            <w:tcW w:type="dxa" w:w="8100"/>
-          </w:tcPr>
-          <w:p>
-            <w:r>
-              <w:rPr>
-                <w:b w:val="false"/>
-                <w:bCs w:val="false"/>
-              </w:rPr>
-              <w:t xml:space="preserve">Factor the Real Estate integration's shared pieces (layout shell, table/detail conventions, permission gating, API client conventions) into reusable primitives, then integrate the Travel industry module the same way, proving the pattern generalizes before a third vertical is attempted.</w:t>
-            </w:r>
-          </w:p>
-        </w:tc>
-      </w:tr>
-      <w:tr>
-        <w:tc>
-          <w:tcPr>
-            <w:tcW w:type="dxa" w:w="1400"/>
-          </w:tcPr>
-          <w:p>
-            <w:r>
-              <w:rPr>
-                <w:b w:val="false"/>
-                <w:bCs w:val="false"/>
-              </w:rPr>
-              <w:t xml:space="preserve">3 — Trust &amp; operations depth</w:t>
-            </w:r>
-          </w:p>
-        </w:tc>
-        <w:tc>
-          <w:tcPr>
-            <w:tcW w:type="dxa" w:w="8100"/>
-          </w:tcPr>
-          <w:p>
-            <w:r>
-              <w:rPr>
-                <w:b w:val="false"/>
-                <w:bCs w:val="false"/>
-              </w:rPr>
-              <w:t xml:space="preserve">Full audit log UI (needs a platform-scoped or tenant-filterable audit endpoint — today's /activity is tenant-only, a backend gap). Platform-wide analytics/reporting expansion. Subscription management actions (upgrade/downgrade/cancel/assign), not just read-only billing views.</w:t>
-            </w:r>
-          </w:p>
-        </w:tc>
-      </w:tr>
-      <w:tr>
-        <w:tc>
-          <w:tcPr>
-            <w:tcW w:type="dxa" w:w="1400"/>
-          </w:tcPr>
-          <w:p>
-            <w:r>
-              <w:rPr>
-                <w:b w:val="false"/>
-                <w:bCs w:val="false"/>
-              </w:rPr>
-              <w:t xml:space="preserve">4 — Broader platform-ops</w:t>
-            </w:r>
-          </w:p>
-        </w:tc>
-        <w:tc>
-          <w:tcPr>
-            <w:tcW w:type="dxa" w:w="8100"/>
-          </w:tcPr>
-          <w:p>
-            <w:r>
-              <w:rPr>
-                <w:b w:val="false"/>
-                <w:bCs w:val="false"/>
-              </w:rPr>
-              <w:t xml:space="preserve">Broker/channel-partner network management (Real Estate roadmap Phase 2). Marketplace moderation tooling (Real Estate roadmap Phase 3). Only here, as an explicit decision, consider whether a tenant-facing dashboard area belongs in this same app.</w:t>
+            <w:tcW w:type="dxa" w:w="1300"/>
+          </w:tcPr>
+          <w:p>
+            <w:r>
+              <w:rPr>
+                <w:b w:val="false"/>
+                <w:bCs w:val="false"/>
+              </w:rPr>
+              <w:t xml:space="preserve">0 — Foundation</w:t>
+            </w:r>
+          </w:p>
+        </w:tc>
+        <w:tc>
+          <w:tcPr>
+            <w:tcW w:type="dxa" w:w="8200"/>
+          </w:tcPr>
+          <w:p>
+            <w:r>
+              <w:rPr>
+                <w:b w:val="false"/>
+                <w:bCs w:val="false"/>
+              </w:rPr>
+              <w:t xml:space="preserve">Next.js scaffold, auth (POST /api/v1/auth/login → Sanctum token → GET /api/v1/auth/me for roles/permissions/tenant), layout shell (sidebar + top bar, permission-driven nav — same “adapt, never fork” principle the Flutter app already follows), a typed API client, CI (lint/typecheck/build). No business screens yet.</w:t>
+            </w:r>
+          </w:p>
+        </w:tc>
+      </w:tr>
+      <w:tr>
+        <w:tc>
+          <w:tcPr>
+            <w:tcW w:type="dxa" w:w="1300"/>
+          </w:tcPr>
+          <w:p>
+            <w:r>
+              <w:rPr>
+                <w:b w:val="false"/>
+                <w:bCs w:val="false"/>
+              </w:rPr>
+              <w:t xml:space="preserve">1 — Organization</w:t>
+            </w:r>
+          </w:p>
+        </w:tc>
+        <w:tc>
+          <w:tcPr>
+            <w:tcW w:type="dxa" w:w="8200"/>
+          </w:tcPr>
+          <w:p>
+            <w:r>
+              <w:rPr>
+                <w:b w:val="false"/>
+                <w:bCs w:val="false"/>
+              </w:rPr>
+              <w:t xml:space="preserve">Company profile, Branches, Departments, Designations (CRUD). Employees list/detail, with terminate. Teams + member management. Users list + role assignment. Roles list (RBAC). Mirrors bizops360-api's Organization module exactly (branches, departments, designations, employees, teams, users, roles — all already live at /api/v1).</w:t>
+            </w:r>
+          </w:p>
+        </w:tc>
+      </w:tr>
+      <w:tr>
+        <w:tc>
+          <w:tcPr>
+            <w:tcW w:type="dxa" w:w="1300"/>
+          </w:tcPr>
+          <w:p>
+            <w:r>
+              <w:rPr>
+                <w:b w:val="false"/>
+                <w:bCs w:val="false"/>
+              </w:rPr>
+              <w:t xml:space="preserve">2 — HR</w:t>
+            </w:r>
+          </w:p>
+        </w:tc>
+        <w:tc>
+          <w:tcPr>
+            <w:tcW w:type="dxa" w:w="8200"/>
+          </w:tcPr>
+          <w:p>
+            <w:r>
+              <w:rPr>
+                <w:b w:val="false"/>
+                <w:bCs w:val="false"/>
+              </w:rPr>
+              <w:t xml:space="preserve">Attendance (check-in/out records, summary, settings, office-location geofence). Leave (types, requests with approve/reject/cancel, balances). Holidays. Employee documents (upload/list, signed-URL download). Matches bizops360-api's HR module.</w:t>
+            </w:r>
+          </w:p>
+        </w:tc>
+      </w:tr>
+      <w:tr>
+        <w:tc>
+          <w:tcPr>
+            <w:tcW w:type="dxa" w:w="1300"/>
+          </w:tcPr>
+          <w:p>
+            <w:r>
+              <w:rPr>
+                <w:b w:val="false"/>
+                <w:bCs w:val="false"/>
+              </w:rPr>
+              <w:t xml:space="preserve">3 — Operations</w:t>
+            </w:r>
+          </w:p>
+        </w:tc>
+        <w:tc>
+          <w:tcPr>
+            <w:tcW w:type="dxa" w:w="8200"/>
+          </w:tcPr>
+          <w:p>
+            <w:r>
+              <w:rPr>
+                <w:b w:val="false"/>
+                <w:bCs w:val="false"/>
+              </w:rPr>
+              <w:t xml:space="preserve">Projects and Tasks (create, assign, status, priority, deadline). Task comments, activities, attachments. An operations overview/workload/department-performance dashboard. Matches bizops360-api's Operations module.</w:t>
+            </w:r>
+          </w:p>
+        </w:tc>
+      </w:tr>
+      <w:tr>
+        <w:tc>
+          <w:tcPr>
+            <w:tcW w:type="dxa" w:w="1300"/>
+          </w:tcPr>
+          <w:p>
+            <w:r>
+              <w:rPr>
+                <w:b w:val="false"/>
+                <w:bCs w:val="false"/>
+              </w:rPr>
+              <w:t xml:space="preserve">4 — CRM</w:t>
+            </w:r>
+          </w:p>
+        </w:tc>
+        <w:tc>
+          <w:tcPr>
+            <w:tcW w:type="dxa" w:w="8200"/>
+          </w:tcPr>
+          <w:p>
+            <w:r>
+              <w:rPr>
+                <w:b w:val="false"/>
+                <w:bCs w:val="false"/>
+              </w:rPr>
+              <w:t xml:space="preserve">Leads (New → Contacted → Interested → Follow-up → Negotiation → Converted pipeline, convert-to-customer), Customers, Contacts, Follow-ups, CRM activities, a CRM reports view. Matches bizops360-api's CRM module.</w:t>
+            </w:r>
+          </w:p>
+        </w:tc>
+      </w:tr>
+      <w:tr>
+        <w:tc>
+          <w:tcPr>
+            <w:tcW w:type="dxa" w:w="1300"/>
+          </w:tcPr>
+          <w:p>
+            <w:r>
+              <w:rPr>
+                <w:b w:val="false"/>
+                <w:bCs w:val="false"/>
+              </w:rPr>
+              <w:t xml:space="preserve">5 — Finance</w:t>
+            </w:r>
+          </w:p>
+        </w:tc>
+        <w:tc>
+          <w:tcPr>
+            <w:tcW w:type="dxa" w:w="8200"/>
+          </w:tcPr>
+          <w:p>
+            <w:r>
+              <w:rPr>
+                <w:b w:val="false"/>
+                <w:bCs w:val="false"/>
+              </w:rPr>
+              <w:t xml:space="preserve">Income, Expenses (with the approval workflow already built server-side), Invoices (create, record payment, refund), Finance reports (profit &amp; loss, outstanding invoices, customer dues, monthly report). Matches bizops360-api's Finance module.</w:t>
+            </w:r>
+          </w:p>
+        </w:tc>
+      </w:tr>
+      <w:tr>
+        <w:tc>
+          <w:tcPr>
+            <w:tcW w:type="dxa" w:w="1300"/>
+          </w:tcPr>
+          <w:p>
+            <w:r>
+              <w:rPr>
+                <w:b w:val="false"/>
+                <w:bCs w:val="false"/>
+              </w:rPr>
+              <w:t xml:space="preserve">6 — Industry module (Real Estate first)</w:t>
+            </w:r>
+          </w:p>
+        </w:tc>
+        <w:tc>
+          <w:tcPr>
+            <w:tcW w:type="dxa" w:w="8200"/>
+          </w:tcPr>
+          <w:p>
+            <w:r>
+              <w:rPr>
+                <w:b w:val="false"/>
+                <w:bCs w:val="false"/>
+              </w:rPr>
+              <w:t xml:space="preserve">One vertical, chosen the same way the spec's own Phase 6 chose one (“Travel or Real Estate — select one for the first commercial proof”): Real Estate, since its backend module is the most complete and has zero UI anywhere today. Project catalogue (projects/buildings/units/amenities/pricing/payment plans), the Phase 1 sales pipeline (requirements, rule-based matching, site visits, offer negotiation, bookings, installments), and the platform-admin project-verification queue. Once this vertical is complete end-to-end, the same integration pattern generalizes to Travel as a follow-on phase.</w:t>
+            </w:r>
+          </w:p>
+        </w:tc>
+      </w:tr>
+      <w:tr>
+        <w:tc>
+          <w:tcPr>
+            <w:tcW w:type="dxa" w:w="1300"/>
+          </w:tcPr>
+          <w:p>
+            <w:r>
+              <w:rPr>
+                <w:b w:val="false"/>
+                <w:bCs w:val="false"/>
+              </w:rPr>
+              <w:t xml:space="preserve">7 — Platform-operator layer</w:t>
+            </w:r>
+          </w:p>
+        </w:tc>
+        <w:tc>
+          <w:tcPr>
+            <w:tcW w:type="dxa" w:w="8200"/>
+          </w:tcPr>
+          <w:p>
+            <w:r>
+              <w:rPr>
+                <w:b w:val="false"/>
+                <w:bCs w:val="false"/>
+              </w:rPr>
+              <w:t xml:space="preserve">The cross-tenant concerns that don't belong to any one tenant's own view: tenant list/detail (needs a new backend endpoint — GET /api/v1/platform/tenants[/{id}] doesn't exist yet), billing/subscription overview (existing GET billing/plans, GET platform/analytics), and a platform-scoped audit log (needs a backend endpoint — today's GET /activity is tenant-only). Placed after the tenant-facing modules because a platform admin still needs to see into a tenant's Organization/CRM/Finance data to do their job — those screens should already exist by this point.</w:t>
+            </w:r>
+          </w:p>
+        </w:tc>
+      </w:tr>
+      <w:tr>
+        <w:tc>
+          <w:tcPr>
+            <w:tcW w:type="dxa" w:w="1300"/>
+          </w:tcPr>
+          <w:p>
+            <w:r>
+              <w:rPr>
+                <w:b w:val="false"/>
+                <w:bCs w:val="false"/>
+              </w:rPr>
+              <w:t xml:space="preserve">8 — Production hardening</w:t>
+            </w:r>
+          </w:p>
+        </w:tc>
+        <w:tc>
+          <w:tcPr>
+            <w:tcW w:type="dxa" w:w="8200"/>
+          </w:tcPr>
+          <w:p>
+            <w:r>
+              <w:rPr>
+                <w:b w:val="false"/>
+                <w:bCs w:val="false"/>
+              </w:rPr>
+              <w:t xml:space="preserve">Deployment pipeline, monitoring, error tracking, performance review, security hardening — mirrors the backend's own Phase 8/9.</w:t>
             </w:r>
           </w:p>
         </w:tc>
@@ -640,7 +752,15 @@
         <w:pStyle w:val="Heading1"/>
       </w:pPr>
       <w:r>
-        <w:t xml:space="preserve">6. Backend prerequisites (in bizops360-api, not this repo)</w:t>
+        <w:t xml:space="preserve">5. Backend prerequisites</w:t>
+      </w:r>
+    </w:p>
+    <w:p>
+      <w:pPr>
+        <w:spacing w:after="160"/>
+      </w:pPr>
+      <w:r>
+        <w:t xml:space="preserve">Phases 1–6 need no new backend work — every endpoint they consume already exists and is already exercised by the Flutter app or (for Real Estate) built and verified in this session. Phase 7 needs two new bizops360-api endpoints:</w:t>
       </w:r>
     </w:p>
     <w:p>
@@ -653,7 +773,7 @@
         <w:spacing w:after="80"/>
       </w:pPr>
       <w:r>
-        <w:t xml:space="preserve">Platform-admin tenant list/detail endpoints — GET /api/v1/platform/tenants and GET /api/v1/platform/tenants/{id} — do not exist yet, needed for Phase 0.</w:t>
+        <w:t xml:space="preserve">Platform-admin tenant list/detail — GET /api/v1/platform/tenants and GET /api/v1/platform/tenants/{id}.</w:t>
       </w:r>
     </w:p>
     <w:p>
@@ -666,7 +786,15 @@
         <w:spacing w:after="80"/>
       </w:pPr>
       <w:r>
-        <w:t xml:space="preserve">A platform-scoped or tenant-filterable audit/activity endpoint — today's GET /api/v1/activity is tenant-only — needed for Phase 3.</w:t>
+        <w:t xml:space="preserve">A platform-scoped or tenant-filterable audit/activity endpoint — today's GET /api/v1/activity is tenant-only.</w:t>
+      </w:r>
+    </w:p>
+    <w:p>
+      <w:pPr>
+        <w:pStyle w:val="Heading1"/>
+      </w:pPr>
+      <w:r>
+        <w:t xml:space="preserve">6. Open items</w:t>
       </w:r>
     </w:p>
     <w:p>
@@ -679,15 +807,7 @@
         <w:spacing w:after="80"/>
       </w:pPr>
       <w:r>
-        <w:t xml:space="preserve">Real Estate's verification queue (POST /api/v1/projects/{id}/verify and /reject, gated by the platform_admin middleware) already exists — no backend work needed for Phase 0/1.</w:t>
-      </w:r>
-    </w:p>
-    <w:p>
-      <w:pPr>
-        <w:pStyle w:val="Heading1"/>
-      </w:pPr>
-      <w:r>
-        <w:t xml:space="preserve">7. Open items</w:t>
+        <w:t xml:space="preserve">The Real Estate roadmap doc and its CLAUDE.md still describe Filament as the reused admin panel technology. Since this plan commits to Next.js instead, those documents should be corrected so a future session doesn't scaffold Filament resources by mistake.</w:t>
       </w:r>
     </w:p>
     <w:p>
@@ -700,20 +820,7 @@
         <w:spacing w:after="80"/>
       </w:pPr>
       <w:r>
-        <w:t xml:space="preserve">The Real Estate roadmap doc and its CLAUDE.md still describe Filament as the reused admin panel technology. Since this plan commits to Next.js instead, those documents should be corrected so a future session doesn't scaffold Filament resources for the verification queue by mistake.</w:t>
-      </w:r>
-    </w:p>
-    <w:p>
-      <w:pPr>
-        <w:pStyle w:val="ListParagraph"/>
-        <w:numPr>
-          <w:ilvl w:val="0"/>
-          <w:numId w:val="2"/>
-        </w:numPr>
-        <w:spacing w:after="80"/>
-      </w:pPr>
-      <w:r>
-        <w:t xml:space="preserve">Persona scope (platform-operator only vs. also a tenant back-office) should stay an explicit decision, revisited no earlier than Phase 4.</w:t>
+        <w:t xml:space="preserve">Whether every module phase gets full CRUD parity with the API or a curated subset (e.g. read-heavy reporting views before every edit flow) is a per-phase judgment call to make when that phase starts, not decided up front.</w:t>
       </w:r>
     </w:p>
     <w:sectPr>

</xml_diff>